<commit_message>
New text in test.txt
</commit_message>
<xml_diff>
--- a/Lr1/ИиКТ_25_ПОз_Ильин_Георгий_Сергеевич_ЛР_1.docx
+++ b/Lr1/ИиКТ_25_ПОз_Ильин_Георгий_Сергеевич_ЛР_1.docx
@@ -526,7 +526,38 @@
           <w:sz w:val="20"/>
           <w:szCs w:val="20"/>
         </w:rPr>
-        <w:t>(фамилия, и.,о.)</w:t>
+        <w:t xml:space="preserve">(фамилия, </w:t>
+      </w:r>
+      <w:proofErr w:type="spellStart"/>
+      <w:proofErr w:type="gramStart"/>
+      <w:r>
+        <w:rPr>
+          <w:rFonts w:ascii="Times New Roman" w:hAnsi="Times New Roman"/>
+          <w:color w:val="7F7F7F"/>
+          <w:sz w:val="20"/>
+          <w:szCs w:val="20"/>
+        </w:rPr>
+        <w:t>и.,о</w:t>
+      </w:r>
+      <w:proofErr w:type="spellEnd"/>
+      <w:r>
+        <w:rPr>
+          <w:rFonts w:ascii="Times New Roman" w:hAnsi="Times New Roman"/>
+          <w:color w:val="7F7F7F"/>
+          <w:sz w:val="20"/>
+          <w:szCs w:val="20"/>
+        </w:rPr>
+        <w:t>.</w:t>
+      </w:r>
+      <w:proofErr w:type="gramEnd"/>
+      <w:r>
+        <w:rPr>
+          <w:rFonts w:ascii="Times New Roman" w:hAnsi="Times New Roman"/>
+          <w:color w:val="7F7F7F"/>
+          <w:sz w:val="20"/>
+          <w:szCs w:val="20"/>
+        </w:rPr>
+        <w:t>)</w:t>
       </w:r>
     </w:p>
     <w:p>
@@ -635,7 +666,38 @@
           <w:szCs w:val="20"/>
         </w:rPr>
         <w:tab/>
-        <w:t xml:space="preserve">(фамилия, и.,о.) </w:t>
+        <w:t xml:space="preserve">(фамилия, </w:t>
+      </w:r>
+      <w:proofErr w:type="spellStart"/>
+      <w:proofErr w:type="gramStart"/>
+      <w:r>
+        <w:rPr>
+          <w:rFonts w:ascii="Times New Roman" w:hAnsi="Times New Roman"/>
+          <w:color w:val="7F7F7F"/>
+          <w:sz w:val="20"/>
+          <w:szCs w:val="20"/>
+        </w:rPr>
+        <w:t>и.,о</w:t>
+      </w:r>
+      <w:proofErr w:type="spellEnd"/>
+      <w:r>
+        <w:rPr>
+          <w:rFonts w:ascii="Times New Roman" w:hAnsi="Times New Roman"/>
+          <w:color w:val="7F7F7F"/>
+          <w:sz w:val="20"/>
+          <w:szCs w:val="20"/>
+        </w:rPr>
+        <w:t>.</w:t>
+      </w:r>
+      <w:proofErr w:type="gramEnd"/>
+      <w:r>
+        <w:rPr>
+          <w:rFonts w:ascii="Times New Roman" w:hAnsi="Times New Roman"/>
+          <w:color w:val="7F7F7F"/>
+          <w:sz w:val="20"/>
+          <w:szCs w:val="20"/>
+        </w:rPr>
+        <w:t xml:space="preserve">) </w:t>
       </w:r>
       <w:r>
         <w:rPr>
@@ -1516,6 +1578,7 @@
         </w:rPr>
         <w:t xml:space="preserve">Вводим переменную </w:t>
       </w:r>
+      <w:proofErr w:type="spellStart"/>
       <w:r>
         <w:rPr>
           <w:rFonts w:ascii="Times New Roman" w:hAnsi="Times New Roman" w:cs="Times New Roman"/>
@@ -1526,6 +1589,7 @@
         </w:rPr>
         <w:t>LenSTR</w:t>
       </w:r>
+      <w:proofErr w:type="spellEnd"/>
       <w:r>
         <w:rPr>
           <w:rFonts w:ascii="Times New Roman" w:hAnsi="Times New Roman" w:cs="Times New Roman"/>
@@ -1607,8 +1671,19 @@
           <w:sz w:val="24"/>
           <w:szCs w:val="24"/>
         </w:rPr>
-        <w:t>Да: переходим в основной алогоритм</w:t>
-      </w:r>
+        <w:t xml:space="preserve">Да: переходим в основной </w:t>
+      </w:r>
+      <w:proofErr w:type="spellStart"/>
+      <w:r>
+        <w:rPr>
+          <w:rFonts w:ascii="Times New Roman" w:hAnsi="Times New Roman" w:cs="Times New Roman"/>
+          <w:color w:val="000000"/>
+          <w:sz w:val="24"/>
+          <w:szCs w:val="24"/>
+        </w:rPr>
+        <w:t>алогоритм</w:t>
+      </w:r>
+      <w:proofErr w:type="spellEnd"/>
     </w:p>
     <w:p>
       <w:pPr>
@@ -1640,6 +1715,7 @@
         </w:rPr>
         <w:t xml:space="preserve">увеличиваем </w:t>
       </w:r>
+      <w:proofErr w:type="spellStart"/>
       <w:r>
         <w:rPr>
           <w:rFonts w:ascii="Times New Roman" w:hAnsi="Times New Roman" w:cs="Times New Roman"/>
@@ -1650,6 +1726,7 @@
         </w:rPr>
         <w:t>LenSTR</w:t>
       </w:r>
+      <w:proofErr w:type="spellEnd"/>
       <w:r>
         <w:rPr>
           <w:rFonts w:ascii="Times New Roman" w:hAnsi="Times New Roman" w:cs="Times New Roman"/>
@@ -1761,6 +1838,7 @@
         </w:rPr>
         <w:t xml:space="preserve">меньше или равен </w:t>
       </w:r>
+      <w:proofErr w:type="spellStart"/>
       <w:r>
         <w:rPr>
           <w:rFonts w:ascii="Times New Roman" w:hAnsi="Times New Roman" w:cs="Times New Roman"/>
@@ -1770,6 +1848,7 @@
         </w:rPr>
         <w:t>LenSTR</w:t>
       </w:r>
+      <w:proofErr w:type="spellEnd"/>
     </w:p>
     <w:p>
       <w:pPr>
@@ -1787,7 +1866,25 @@
           <w:sz w:val="24"/>
           <w:szCs w:val="24"/>
         </w:rPr>
-        <w:t>Да: Если символ строки равен эталонному символу</w:t>
+        <w:t>Да</w:t>
+      </w:r>
+      <w:proofErr w:type="gramStart"/>
+      <w:r>
+        <w:rPr>
+          <w:rFonts w:ascii="Times New Roman" w:hAnsi="Times New Roman" w:cs="Times New Roman"/>
+          <w:sz w:val="24"/>
+          <w:szCs w:val="24"/>
+        </w:rPr>
+        <w:t>: Если</w:t>
+      </w:r>
+      <w:proofErr w:type="gramEnd"/>
+      <w:r>
+        <w:rPr>
+          <w:rFonts w:ascii="Times New Roman" w:hAnsi="Times New Roman" w:cs="Times New Roman"/>
+          <w:sz w:val="24"/>
+          <w:szCs w:val="24"/>
+        </w:rPr>
+        <w:t xml:space="preserve"> символ строки равен эталонному символу</w:t>
       </w:r>
     </w:p>
     <w:p>
@@ -1798,16 +1895,33 @@
           <w:rFonts w:ascii="Times New Roman" w:hAnsi="Times New Roman" w:cs="Times New Roman"/>
           <w:sz w:val="24"/>
           <w:szCs w:val="24"/>
-          <w:lang w:val="en-US"/>
-        </w:rPr>
-      </w:pPr>
-      <w:r>
-        <w:rPr>
-          <w:rFonts w:ascii="Times New Roman" w:hAnsi="Times New Roman" w:cs="Times New Roman"/>
-          <w:sz w:val="24"/>
-          <w:szCs w:val="24"/>
-        </w:rPr>
-        <w:t xml:space="preserve">Да: Увеличиваем счетчик </w:t>
+        </w:rPr>
+      </w:pPr>
+      <w:r>
+        <w:rPr>
+          <w:rFonts w:ascii="Times New Roman" w:hAnsi="Times New Roman" w:cs="Times New Roman"/>
+          <w:sz w:val="24"/>
+          <w:szCs w:val="24"/>
+        </w:rPr>
+        <w:t>Да</w:t>
+      </w:r>
+      <w:proofErr w:type="gramStart"/>
+      <w:r>
+        <w:rPr>
+          <w:rFonts w:ascii="Times New Roman" w:hAnsi="Times New Roman" w:cs="Times New Roman"/>
+          <w:sz w:val="24"/>
+          <w:szCs w:val="24"/>
+        </w:rPr>
+        <w:t>: Увеличиваем</w:t>
+      </w:r>
+      <w:proofErr w:type="gramEnd"/>
+      <w:r>
+        <w:rPr>
+          <w:rFonts w:ascii="Times New Roman" w:hAnsi="Times New Roman" w:cs="Times New Roman"/>
+          <w:sz w:val="24"/>
+          <w:szCs w:val="24"/>
+        </w:rPr>
+        <w:t xml:space="preserve"> счетчик </w:t>
       </w:r>
       <w:r>
         <w:rPr>
@@ -1914,7 +2028,25 @@
           <w:sz w:val="24"/>
           <w:szCs w:val="24"/>
         </w:rPr>
-        <w:t>Нет: Выводим счетчик эталонного символа и выходим из программы.</w:t>
+        <w:t>Нет</w:t>
+      </w:r>
+      <w:proofErr w:type="gramStart"/>
+      <w:r>
+        <w:rPr>
+          <w:rFonts w:ascii="Times New Roman" w:hAnsi="Times New Roman" w:cs="Times New Roman"/>
+          <w:sz w:val="24"/>
+          <w:szCs w:val="24"/>
+        </w:rPr>
+        <w:t>: Выводим</w:t>
+      </w:r>
+      <w:proofErr w:type="gramEnd"/>
+      <w:r>
+        <w:rPr>
+          <w:rFonts w:ascii="Times New Roman" w:hAnsi="Times New Roman" w:cs="Times New Roman"/>
+          <w:sz w:val="24"/>
+          <w:szCs w:val="24"/>
+        </w:rPr>
+        <w:t xml:space="preserve"> счетчик эталонного символа и выходим из программы.</w:t>
       </w:r>
     </w:p>
     <w:p>
@@ -1985,6 +2117,7 @@
           <w:rFonts w:ascii="Times New Roman" w:hAnsi="Times New Roman" w:cs="Times New Roman"/>
           <w:b/>
           <w:bCs/>
+          <w:lang w:val="en-US"/>
         </w:rPr>
       </w:pPr>
       <w:r>
@@ -1994,727 +2127,1095 @@
           <w:bCs/>
         </w:rPr>
         <w:lastRenderedPageBreak/>
-        <w:t>Код от задания:</w:t>
-      </w:r>
-    </w:p>
-    <w:p>
-      <w:pPr>
-        <w:spacing w:after="160" w:line="259" w:lineRule="auto"/>
-        <w:rPr>
-          <w:rFonts w:ascii="Times New Roman" w:hAnsi="Times New Roman" w:cs="Times New Roman"/>
-          <w:lang w:val="en-US"/>
-        </w:rPr>
-      </w:pPr>
-      <w:r>
-        <w:rPr>
-          <w:rFonts w:ascii="Times New Roman" w:hAnsi="Times New Roman" w:cs="Times New Roman"/>
-          <w:lang w:val="en-US"/>
-        </w:rPr>
-        <w:t>program CountChar;</w:t>
-      </w:r>
-    </w:p>
-    <w:p>
-      <w:pPr>
-        <w:spacing w:after="160" w:line="259" w:lineRule="auto"/>
-        <w:rPr>
-          <w:rFonts w:ascii="Times New Roman" w:hAnsi="Times New Roman" w:cs="Times New Roman"/>
-          <w:lang w:val="en-US"/>
-        </w:rPr>
-      </w:pPr>
-    </w:p>
-    <w:p>
-      <w:pPr>
-        <w:spacing w:after="160" w:line="259" w:lineRule="auto"/>
-        <w:rPr>
-          <w:rFonts w:ascii="Times New Roman" w:hAnsi="Times New Roman" w:cs="Times New Roman"/>
-          <w:lang w:val="en-US"/>
-        </w:rPr>
-      </w:pPr>
-      <w:r>
-        <w:rPr>
-          <w:rFonts w:ascii="Times New Roman" w:hAnsi="Times New Roman" w:cs="Times New Roman"/>
-          <w:lang w:val="en-US"/>
-        </w:rPr>
-        <w:t>var</w:t>
-      </w:r>
-    </w:p>
-    <w:p>
-      <w:pPr>
-        <w:spacing w:after="160" w:line="259" w:lineRule="auto"/>
-        <w:rPr>
-          <w:rFonts w:ascii="Times New Roman" w:hAnsi="Times New Roman" w:cs="Times New Roman"/>
-          <w:lang w:val="en-US"/>
-        </w:rPr>
-      </w:pPr>
-      <w:r>
-        <w:rPr>
-          <w:rFonts w:ascii="Times New Roman" w:hAnsi="Times New Roman" w:cs="Times New Roman"/>
-          <w:lang w:val="en-US"/>
-        </w:rPr>
-        <w:t xml:space="preserve">  </w:t>
-      </w:r>
-      <w:r>
-        <w:rPr>
-          <w:rFonts w:ascii="Times New Roman" w:hAnsi="Times New Roman" w:cs="Times New Roman"/>
-          <w:lang w:val="en-US"/>
-        </w:rPr>
-        <w:t>LenSTR</w:t>
-      </w:r>
-      <w:r>
-        <w:rPr>
-          <w:rFonts w:ascii="Times New Roman" w:hAnsi="Times New Roman" w:cs="Times New Roman"/>
-          <w:lang w:val="en-US"/>
-        </w:rPr>
-        <w:t>: string;</w:t>
-      </w:r>
-    </w:p>
-    <w:p>
-      <w:pPr>
-        <w:spacing w:after="160" w:line="259" w:lineRule="auto"/>
-        <w:rPr>
-          <w:rFonts w:ascii="Times New Roman" w:hAnsi="Times New Roman" w:cs="Times New Roman"/>
-          <w:lang w:val="en-US"/>
-        </w:rPr>
-      </w:pPr>
-      <w:r>
-        <w:rPr>
-          <w:rFonts w:ascii="Times New Roman" w:hAnsi="Times New Roman" w:cs="Times New Roman"/>
-          <w:lang w:val="en-US"/>
-        </w:rPr>
-        <w:t xml:space="preserve">  </w:t>
-      </w:r>
-      <w:r>
-        <w:rPr>
-          <w:rFonts w:ascii="Times New Roman" w:hAnsi="Times New Roman" w:cs="Times New Roman"/>
-          <w:lang w:val="en-US"/>
-        </w:rPr>
-        <w:t>STR(i)</w:t>
-      </w:r>
-      <w:r>
-        <w:rPr>
-          <w:rFonts w:ascii="Times New Roman" w:hAnsi="Times New Roman" w:cs="Times New Roman"/>
-          <w:lang w:val="en-US"/>
-        </w:rPr>
-        <w:t>: char;</w:t>
-      </w:r>
-    </w:p>
-    <w:p>
-      <w:pPr>
-        <w:spacing w:after="160" w:line="259" w:lineRule="auto"/>
-        <w:rPr>
-          <w:rFonts w:ascii="Times New Roman" w:hAnsi="Times New Roman" w:cs="Times New Roman"/>
-          <w:lang w:val="en-US"/>
-        </w:rPr>
-      </w:pPr>
-      <w:r>
-        <w:rPr>
-          <w:rFonts w:ascii="Times New Roman" w:hAnsi="Times New Roman" w:cs="Times New Roman"/>
-          <w:lang w:val="en-US"/>
-        </w:rPr>
-        <w:t xml:space="preserve">  i, </w:t>
-      </w:r>
-      <w:r>
-        <w:rPr>
-          <w:rFonts w:ascii="Times New Roman" w:hAnsi="Times New Roman" w:cs="Times New Roman"/>
-          <w:lang w:val="en-US"/>
-        </w:rPr>
-        <w:t>S</w:t>
-      </w:r>
-      <w:r>
-        <w:rPr>
-          <w:rFonts w:ascii="Times New Roman" w:hAnsi="Times New Roman" w:cs="Times New Roman"/>
-          <w:lang w:val="en-US"/>
-        </w:rPr>
-        <w:t>: integer;</w:t>
-      </w:r>
-    </w:p>
-    <w:p>
-      <w:pPr>
-        <w:spacing w:after="160" w:line="259" w:lineRule="auto"/>
-        <w:rPr>
-          <w:rFonts w:ascii="Times New Roman" w:hAnsi="Times New Roman" w:cs="Times New Roman"/>
-          <w:lang w:val="en-US"/>
-        </w:rPr>
-      </w:pPr>
-    </w:p>
-    <w:p>
-      <w:pPr>
-        <w:spacing w:after="160" w:line="259" w:lineRule="auto"/>
-        <w:rPr>
-          <w:rFonts w:ascii="Times New Roman" w:hAnsi="Times New Roman" w:cs="Times New Roman"/>
-          <w:lang w:val="en-US"/>
-        </w:rPr>
-      </w:pPr>
-      <w:r>
-        <w:rPr>
-          <w:rFonts w:ascii="Times New Roman" w:hAnsi="Times New Roman" w:cs="Times New Roman"/>
-          <w:lang w:val="en-US"/>
-        </w:rPr>
-        <w:t>begin</w:t>
-      </w:r>
-    </w:p>
-    <w:p>
-      <w:pPr>
-        <w:spacing w:after="160" w:line="259" w:lineRule="auto"/>
-        <w:rPr>
-          <w:rFonts w:ascii="Times New Roman" w:hAnsi="Times New Roman" w:cs="Times New Roman"/>
-          <w:lang w:val="en-US"/>
-        </w:rPr>
-      </w:pPr>
-      <w:r>
-        <w:rPr>
-          <w:rFonts w:ascii="Times New Roman" w:hAnsi="Times New Roman" w:cs="Times New Roman"/>
-          <w:lang w:val="en-US"/>
-        </w:rPr>
-        <w:t xml:space="preserve">  { </w:t>
-      </w:r>
-      <w:r>
-        <w:rPr>
-          <w:rFonts w:ascii="Times New Roman" w:hAnsi="Times New Roman" w:cs="Times New Roman"/>
-        </w:rPr>
-        <w:t>Ввод</w:t>
-      </w:r>
-      <w:r>
-        <w:rPr>
-          <w:rFonts w:ascii="Times New Roman" w:hAnsi="Times New Roman" w:cs="Times New Roman"/>
-          <w:lang w:val="en-US"/>
-        </w:rPr>
-        <w:t xml:space="preserve"> </w:t>
-      </w:r>
-      <w:r>
-        <w:rPr>
-          <w:rFonts w:ascii="Times New Roman" w:hAnsi="Times New Roman" w:cs="Times New Roman"/>
-        </w:rPr>
-        <w:t>строки</w:t>
-      </w:r>
-      <w:r>
-        <w:rPr>
-          <w:rFonts w:ascii="Times New Roman" w:hAnsi="Times New Roman" w:cs="Times New Roman"/>
-          <w:lang w:val="en-US"/>
-        </w:rPr>
-        <w:t xml:space="preserve"> }</w:t>
-      </w:r>
-    </w:p>
-    <w:p>
-      <w:pPr>
-        <w:spacing w:after="160" w:line="259" w:lineRule="auto"/>
-        <w:rPr>
-          <w:rFonts w:ascii="Times New Roman" w:hAnsi="Times New Roman" w:cs="Times New Roman"/>
-          <w:lang w:val="en-US"/>
-        </w:rPr>
-      </w:pPr>
-      <w:r>
-        <w:rPr>
-          <w:rFonts w:ascii="Times New Roman" w:hAnsi="Times New Roman" w:cs="Times New Roman"/>
-          <w:lang w:val="en-US"/>
-        </w:rPr>
-        <w:t xml:space="preserve">  readln(</w:t>
-      </w:r>
-      <w:r>
-        <w:rPr>
-          <w:rFonts w:ascii="Times New Roman" w:hAnsi="Times New Roman" w:cs="Times New Roman"/>
-          <w:lang w:val="en-US"/>
-        </w:rPr>
-        <w:t>LenSTR</w:t>
-      </w:r>
-      <w:r>
-        <w:rPr>
-          <w:rFonts w:ascii="Times New Roman" w:hAnsi="Times New Roman" w:cs="Times New Roman"/>
-          <w:lang w:val="en-US"/>
-        </w:rPr>
-        <w:t>);</w:t>
-      </w:r>
-    </w:p>
-    <w:p>
-      <w:pPr>
-        <w:spacing w:after="160" w:line="259" w:lineRule="auto"/>
-        <w:rPr>
-          <w:rFonts w:ascii="Times New Roman" w:hAnsi="Times New Roman" w:cs="Times New Roman"/>
-          <w:lang w:val="en-US"/>
-        </w:rPr>
-      </w:pPr>
-    </w:p>
-    <w:p>
-      <w:pPr>
-        <w:spacing w:after="160" w:line="259" w:lineRule="auto"/>
-        <w:rPr>
-          <w:rFonts w:ascii="Times New Roman" w:hAnsi="Times New Roman" w:cs="Times New Roman"/>
-        </w:rPr>
-      </w:pPr>
-      <w:r>
-        <w:rPr>
-          <w:rFonts w:ascii="Times New Roman" w:hAnsi="Times New Roman" w:cs="Times New Roman"/>
-          <w:lang w:val="en-US"/>
-        </w:rPr>
-        <w:t xml:space="preserve">  </w:t>
-      </w:r>
-      <w:r>
-        <w:rPr>
-          <w:rFonts w:ascii="Times New Roman" w:hAnsi="Times New Roman" w:cs="Times New Roman"/>
-        </w:rPr>
-        <w:t>{ Ввод эталонного символа (первый символ введённой строки) }</w:t>
-      </w:r>
-    </w:p>
-    <w:p>
-      <w:pPr>
-        <w:spacing w:after="160" w:line="259" w:lineRule="auto"/>
-        <w:rPr>
-          <w:rFonts w:ascii="Times New Roman" w:hAnsi="Times New Roman" w:cs="Times New Roman"/>
-          <w:lang w:val="en-US"/>
-        </w:rPr>
-      </w:pPr>
-      <w:r>
-        <w:rPr>
-          <w:rFonts w:ascii="Times New Roman" w:hAnsi="Times New Roman" w:cs="Times New Roman"/>
-          <w:lang w:val="en-US"/>
-        </w:rPr>
-        <w:t xml:space="preserve">  readln(</w:t>
-      </w:r>
-      <w:r>
-        <w:rPr>
-          <w:rFonts w:ascii="Times New Roman" w:hAnsi="Times New Roman" w:cs="Times New Roman"/>
-          <w:lang w:val="en-US"/>
-        </w:rPr>
-        <w:t>STR(i)</w:t>
-      </w:r>
-      <w:r>
-        <w:rPr>
-          <w:rFonts w:ascii="Times New Roman" w:hAnsi="Times New Roman" w:cs="Times New Roman"/>
-          <w:lang w:val="en-US"/>
-        </w:rPr>
-        <w:t>);</w:t>
-      </w:r>
-    </w:p>
-    <w:p>
-      <w:pPr>
-        <w:spacing w:after="160" w:line="259" w:lineRule="auto"/>
-        <w:rPr>
-          <w:rFonts w:ascii="Times New Roman" w:hAnsi="Times New Roman" w:cs="Times New Roman"/>
-          <w:lang w:val="en-US"/>
-        </w:rPr>
-      </w:pPr>
-      <w:r>
-        <w:rPr>
-          <w:rFonts w:ascii="Times New Roman" w:hAnsi="Times New Roman" w:cs="Times New Roman"/>
-          <w:lang w:val="en-US"/>
-        </w:rPr>
-        <w:t>LenSTR</w:t>
-      </w:r>
-      <w:r>
-        <w:rPr>
-          <w:rFonts w:ascii="Times New Roman" w:hAnsi="Times New Roman" w:cs="Times New Roman"/>
-          <w:lang w:val="en-US"/>
-        </w:rPr>
-        <w:t>:</w:t>
-      </w:r>
-      <w:r>
-        <w:rPr>
-          <w:rFonts w:ascii="Times New Roman" w:hAnsi="Times New Roman" w:cs="Times New Roman"/>
-          <w:lang w:val="en-US"/>
-        </w:rPr>
-        <w:t>=0;</w:t>
-      </w:r>
-    </w:p>
-    <w:p>
-      <w:pPr>
-        <w:spacing w:after="160" w:line="259" w:lineRule="auto"/>
-        <w:rPr>
-          <w:rFonts w:ascii="Times New Roman" w:hAnsi="Times New Roman" w:cs="Times New Roman"/>
-          <w:lang w:val="en-US"/>
-        </w:rPr>
-      </w:pPr>
-      <w:r>
-        <w:rPr>
-          <w:rFonts w:ascii="Times New Roman" w:hAnsi="Times New Roman" w:cs="Times New Roman"/>
-          <w:lang w:val="en-US"/>
-        </w:rPr>
-        <w:t>i</w:t>
-      </w:r>
-      <w:r>
-        <w:rPr>
-          <w:rFonts w:ascii="Times New Roman" w:hAnsi="Times New Roman" w:cs="Times New Roman"/>
-          <w:lang w:val="en-US"/>
-        </w:rPr>
-        <w:t>:</w:t>
-      </w:r>
-      <w:r>
-        <w:rPr>
-          <w:rFonts w:ascii="Times New Roman" w:hAnsi="Times New Roman" w:cs="Times New Roman"/>
-          <w:lang w:val="en-US"/>
-        </w:rPr>
-        <w:t>=1;</w:t>
-      </w:r>
-    </w:p>
-    <w:p>
-      <w:pPr>
-        <w:spacing w:after="160" w:line="259" w:lineRule="auto"/>
-        <w:rPr>
-          <w:rFonts w:ascii="Times New Roman" w:hAnsi="Times New Roman" w:cs="Times New Roman"/>
-          <w:lang w:val="en-US"/>
-        </w:rPr>
-      </w:pPr>
-      <w:r>
-        <w:rPr>
-          <w:rFonts w:ascii="Times New Roman" w:hAnsi="Times New Roman" w:cs="Times New Roman"/>
-          <w:lang w:val="en-US"/>
-        </w:rPr>
-        <w:t>if (STR(i)=#){</w:t>
-      </w:r>
-    </w:p>
-    <w:p>
-      <w:pPr>
-        <w:spacing w:after="160" w:line="259" w:lineRule="auto"/>
-        <w:rPr>
-          <w:rFonts w:ascii="Times New Roman" w:hAnsi="Times New Roman" w:cs="Times New Roman"/>
-          <w:lang w:val="en-US"/>
-        </w:rPr>
-      </w:pPr>
-      <w:r>
-        <w:rPr>
-          <w:rFonts w:ascii="Times New Roman" w:hAnsi="Times New Roman" w:cs="Times New Roman"/>
-          <w:lang w:val="en-US"/>
-        </w:rPr>
-        <w:t>end} else {LenSTR</w:t>
-      </w:r>
-      <w:r>
-        <w:rPr>
-          <w:rFonts w:ascii="Times New Roman" w:hAnsi="Times New Roman" w:cs="Times New Roman"/>
-          <w:lang w:val="en-US"/>
-        </w:rPr>
-        <w:t>:</w:t>
-      </w:r>
-      <w:r>
-        <w:rPr>
-          <w:rFonts w:ascii="Times New Roman" w:hAnsi="Times New Roman" w:cs="Times New Roman"/>
-          <w:lang w:val="en-US"/>
-        </w:rPr>
-        <w:t>=LenSTR+1;</w:t>
-      </w:r>
-    </w:p>
-    <w:p>
-      <w:pPr>
-        <w:spacing w:after="160" w:line="259" w:lineRule="auto"/>
-        <w:rPr>
-          <w:rFonts w:ascii="Times New Roman" w:hAnsi="Times New Roman" w:cs="Times New Roman"/>
-          <w:lang w:val="en-US"/>
-        </w:rPr>
-      </w:pPr>
-      <w:r>
-        <w:rPr>
-          <w:rFonts w:ascii="Times New Roman" w:hAnsi="Times New Roman" w:cs="Times New Roman"/>
-          <w:lang w:val="en-US"/>
-        </w:rPr>
-        <w:t>i</w:t>
-      </w:r>
-      <w:r>
-        <w:rPr>
-          <w:rFonts w:ascii="Times New Roman" w:hAnsi="Times New Roman" w:cs="Times New Roman"/>
-          <w:lang w:val="en-US"/>
-        </w:rPr>
-        <w:t>:</w:t>
-      </w:r>
-      <w:r>
-        <w:rPr>
-          <w:rFonts w:ascii="Times New Roman" w:hAnsi="Times New Roman" w:cs="Times New Roman"/>
-          <w:lang w:val="en-US"/>
-        </w:rPr>
-        <w:t>=i+1;}</w:t>
-      </w:r>
-    </w:p>
-    <w:p>
-      <w:pPr>
-        <w:spacing w:after="160" w:line="259" w:lineRule="auto"/>
-        <w:rPr>
-          <w:rFonts w:ascii="Times New Roman" w:hAnsi="Times New Roman" w:cs="Times New Roman"/>
-          <w:lang w:val="en-US"/>
-        </w:rPr>
-      </w:pPr>
-    </w:p>
-    <w:p>
-      <w:pPr>
-        <w:spacing w:after="160" w:line="259" w:lineRule="auto"/>
-        <w:rPr>
-          <w:rFonts w:ascii="Times New Roman" w:hAnsi="Times New Roman" w:cs="Times New Roman"/>
-          <w:lang w:val="en-US"/>
-        </w:rPr>
-      </w:pPr>
-      <w:r>
-        <w:rPr>
-          <w:rFonts w:ascii="Times New Roman" w:hAnsi="Times New Roman" w:cs="Times New Roman"/>
-          <w:lang w:val="en-US"/>
-        </w:rPr>
-        <w:t xml:space="preserve">  </w:t>
-      </w:r>
-      <w:r>
-        <w:rPr>
-          <w:rFonts w:ascii="Times New Roman" w:hAnsi="Times New Roman" w:cs="Times New Roman"/>
-          <w:lang w:val="en-US"/>
-        </w:rPr>
-        <w:t>S</w:t>
-      </w:r>
-      <w:r>
-        <w:rPr>
-          <w:rFonts w:ascii="Times New Roman" w:hAnsi="Times New Roman" w:cs="Times New Roman"/>
-          <w:lang w:val="en-US"/>
-        </w:rPr>
-        <w:t xml:space="preserve"> := 0;</w:t>
-      </w:r>
-    </w:p>
-    <w:p>
-      <w:pPr>
-        <w:spacing w:after="160" w:line="259" w:lineRule="auto"/>
-        <w:rPr>
-          <w:rFonts w:ascii="Times New Roman" w:hAnsi="Times New Roman" w:cs="Times New Roman"/>
-          <w:lang w:val="en-US"/>
-        </w:rPr>
-      </w:pPr>
-      <w:r>
-        <w:rPr>
-          <w:rFonts w:ascii="Times New Roman" w:hAnsi="Times New Roman" w:cs="Times New Roman"/>
-          <w:lang w:val="en-US"/>
-        </w:rPr>
-        <w:t>i</w:t>
-      </w:r>
-      <w:r>
-        <w:rPr>
-          <w:rFonts w:ascii="Times New Roman" w:hAnsi="Times New Roman" w:cs="Times New Roman"/>
-          <w:lang w:val="en-US"/>
-        </w:rPr>
-        <w:t>:</w:t>
-      </w:r>
-      <w:r>
-        <w:rPr>
-          <w:rFonts w:ascii="Times New Roman" w:hAnsi="Times New Roman" w:cs="Times New Roman"/>
-          <w:lang w:val="en-US"/>
-        </w:rPr>
-        <w:t>=1;</w:t>
-      </w:r>
-    </w:p>
-    <w:p>
-      <w:pPr>
-        <w:spacing w:after="160" w:line="259" w:lineRule="auto"/>
-        <w:rPr>
-          <w:rFonts w:ascii="Times New Roman" w:hAnsi="Times New Roman" w:cs="Times New Roman"/>
-          <w:lang w:val="en-US"/>
-        </w:rPr>
-      </w:pPr>
-      <w:r>
-        <w:rPr>
-          <w:rFonts w:ascii="Times New Roman" w:hAnsi="Times New Roman" w:cs="Times New Roman"/>
-          <w:lang w:val="en-US"/>
-        </w:rPr>
-        <w:t xml:space="preserve">  for i := 1 to length(</w:t>
-      </w:r>
-      <w:r>
-        <w:rPr>
-          <w:rFonts w:ascii="Times New Roman" w:hAnsi="Times New Roman" w:cs="Times New Roman"/>
-          <w:lang w:val="en-US"/>
-        </w:rPr>
-        <w:t>LenSTR</w:t>
-      </w:r>
-      <w:r>
-        <w:rPr>
-          <w:rFonts w:ascii="Times New Roman" w:hAnsi="Times New Roman" w:cs="Times New Roman"/>
-          <w:lang w:val="en-US"/>
-        </w:rPr>
-        <w:t>) do</w:t>
-      </w:r>
-    </w:p>
-    <w:p>
-      <w:pPr>
-        <w:spacing w:after="160" w:line="259" w:lineRule="auto"/>
-        <w:rPr>
-          <w:rFonts w:ascii="Times New Roman" w:hAnsi="Times New Roman" w:cs="Times New Roman"/>
-          <w:lang w:val="en-US"/>
-        </w:rPr>
-      </w:pPr>
-      <w:r>
-        <w:rPr>
-          <w:rFonts w:ascii="Times New Roman" w:hAnsi="Times New Roman" w:cs="Times New Roman"/>
-          <w:lang w:val="en-US"/>
-        </w:rPr>
-        <w:t xml:space="preserve">    if </w:t>
-      </w:r>
-      <w:r>
-        <w:rPr>
-          <w:rFonts w:ascii="Times New Roman" w:hAnsi="Times New Roman" w:cs="Times New Roman"/>
-          <w:lang w:val="en-US"/>
-        </w:rPr>
-        <w:t>(</w:t>
-      </w:r>
-      <w:r>
-        <w:rPr>
-          <w:rFonts w:ascii="Times New Roman" w:hAnsi="Times New Roman" w:cs="Times New Roman"/>
-          <w:lang w:val="en-US"/>
-        </w:rPr>
-        <w:t>LenSTR</w:t>
-      </w:r>
-      <w:r>
-        <w:rPr>
-          <w:rFonts w:ascii="Times New Roman" w:hAnsi="Times New Roman" w:cs="Times New Roman"/>
-          <w:lang w:val="en-US"/>
-        </w:rPr>
-        <w:t>[i] =</w:t>
-      </w:r>
-      <w:r>
-        <w:rPr>
-          <w:rFonts w:ascii="Times New Roman" w:hAnsi="Times New Roman" w:cs="Times New Roman"/>
-          <w:lang w:val="en-US"/>
-        </w:rPr>
-        <w:t>&gt;</w:t>
-      </w:r>
-      <w:r>
-        <w:rPr>
-          <w:rFonts w:ascii="Times New Roman" w:hAnsi="Times New Roman" w:cs="Times New Roman"/>
-          <w:lang w:val="en-US"/>
-        </w:rPr>
-        <w:t xml:space="preserve"> </w:t>
-      </w:r>
-      <w:r>
-        <w:rPr>
-          <w:rFonts w:ascii="Times New Roman" w:hAnsi="Times New Roman" w:cs="Times New Roman"/>
-          <w:lang w:val="en-US"/>
-        </w:rPr>
-        <w:t>i</w:t>
-      </w:r>
-      <w:r>
-        <w:rPr>
-          <w:rFonts w:ascii="Times New Roman" w:hAnsi="Times New Roman" w:cs="Times New Roman"/>
-          <w:lang w:val="en-US"/>
-        </w:rPr>
-        <w:t>){if (STR(i)=E){S:=S+1} else {i:=i+1}</w:t>
-      </w:r>
-      <w:r>
-        <w:rPr>
-          <w:rFonts w:ascii="Times New Roman" w:hAnsi="Times New Roman" w:cs="Times New Roman"/>
-          <w:lang w:val="en-US"/>
-        </w:rPr>
-        <w:t xml:space="preserve"> then</w:t>
-      </w:r>
-      <w:r>
-        <w:rPr>
-          <w:rFonts w:ascii="Times New Roman" w:hAnsi="Times New Roman" w:cs="Times New Roman"/>
-          <w:lang w:val="en-US"/>
-        </w:rPr>
-        <w:t xml:space="preserve"> </w:t>
-      </w:r>
-    </w:p>
-    <w:p>
-      <w:pPr>
-        <w:spacing w:after="160" w:line="259" w:lineRule="auto"/>
-        <w:rPr>
-          <w:rFonts w:ascii="Times New Roman" w:hAnsi="Times New Roman" w:cs="Times New Roman"/>
-          <w:lang w:val="en-US"/>
-        </w:rPr>
-      </w:pPr>
-      <w:r>
-        <w:rPr>
-          <w:rFonts w:ascii="Times New Roman" w:hAnsi="Times New Roman" w:cs="Times New Roman"/>
-          <w:lang w:val="en-US"/>
-        </w:rPr>
-        <w:t xml:space="preserve">      inc(</w:t>
-      </w:r>
-      <w:r>
-        <w:rPr>
-          <w:rFonts w:ascii="Times New Roman" w:hAnsi="Times New Roman" w:cs="Times New Roman"/>
-          <w:lang w:val="en-US"/>
-        </w:rPr>
-        <w:t>S</w:t>
-      </w:r>
-      <w:r>
-        <w:rPr>
-          <w:rFonts w:ascii="Times New Roman" w:hAnsi="Times New Roman" w:cs="Times New Roman"/>
-          <w:lang w:val="en-US"/>
-        </w:rPr>
-        <w:t>);</w:t>
-      </w:r>
-    </w:p>
-    <w:p>
-      <w:pPr>
-        <w:spacing w:after="160" w:line="259" w:lineRule="auto"/>
-        <w:rPr>
-          <w:rFonts w:ascii="Times New Roman" w:hAnsi="Times New Roman" w:cs="Times New Roman"/>
-          <w:lang w:val="en-US"/>
-        </w:rPr>
-      </w:pPr>
-    </w:p>
-    <w:p>
-      <w:pPr>
-        <w:spacing w:after="160" w:line="259" w:lineRule="auto"/>
-        <w:rPr>
-          <w:rFonts w:ascii="Times New Roman" w:hAnsi="Times New Roman" w:cs="Times New Roman"/>
-          <w:lang w:val="en-US"/>
-        </w:rPr>
-      </w:pPr>
-      <w:r>
-        <w:rPr>
-          <w:rFonts w:ascii="Times New Roman" w:hAnsi="Times New Roman" w:cs="Times New Roman"/>
-          <w:lang w:val="en-US"/>
-        </w:rPr>
-        <w:t xml:space="preserve">  writeln(</w:t>
-      </w:r>
-      <w:r>
-        <w:rPr>
-          <w:rFonts w:ascii="Times New Roman" w:hAnsi="Times New Roman" w:cs="Times New Roman"/>
-          <w:lang w:val="en-US"/>
-        </w:rPr>
-        <w:t>S</w:t>
-      </w:r>
-      <w:r>
-        <w:rPr>
-          <w:rFonts w:ascii="Times New Roman" w:hAnsi="Times New Roman" w:cs="Times New Roman"/>
-          <w:lang w:val="en-US"/>
-        </w:rPr>
-        <w:t>);</w:t>
-      </w:r>
-    </w:p>
-    <w:p>
-      <w:pPr>
-        <w:spacing w:after="160" w:line="259" w:lineRule="auto"/>
-        <w:rPr>
-          <w:rFonts w:ascii="Times New Roman" w:hAnsi="Times New Roman" w:cs="Times New Roman"/>
-          <w:lang w:val="en-US"/>
-        </w:rPr>
-      </w:pPr>
-      <w:r>
-        <w:rPr>
-          <w:rFonts w:ascii="Times New Roman" w:hAnsi="Times New Roman" w:cs="Times New Roman"/>
-          <w:lang w:val="en-US"/>
-        </w:rPr>
-        <w:t>end.</w:t>
-      </w:r>
-    </w:p>
-    <w:p>
-      <w:pPr>
-        <w:spacing w:after="160" w:line="259" w:lineRule="auto"/>
-        <w:rPr>
-          <w:rFonts w:ascii="Times New Roman" w:hAnsi="Times New Roman" w:cs="Times New Roman"/>
-          <w:lang w:val="en-US"/>
-        </w:rPr>
-      </w:pPr>
-      <w:r>
-        <w:rPr>
-          <w:rFonts w:ascii="Times New Roman" w:hAnsi="Times New Roman" w:cs="Times New Roman"/>
-          <w:lang w:val="en-US"/>
-        </w:rPr>
-        <w:br w:type="page"/>
-      </w:r>
-    </w:p>
-    <w:p>
-      <w:pPr>
-        <w:spacing w:after="160" w:line="259" w:lineRule="auto"/>
+        <w:t>Код</w:t>
+      </w:r>
+      <w:r>
         <w:rPr>
           <w:rFonts w:ascii="Times New Roman" w:hAnsi="Times New Roman" w:cs="Times New Roman"/>
           <w:b/>
           <w:bCs/>
-        </w:rPr>
-      </w:pPr>
+          <w:lang w:val="en-US"/>
+        </w:rPr>
+        <w:t xml:space="preserve"> </w:t>
+      </w:r>
       <w:r>
         <w:rPr>
           <w:rFonts w:ascii="Times New Roman" w:hAnsi="Times New Roman" w:cs="Times New Roman"/>
           <w:b/>
           <w:bCs/>
         </w:rPr>
+        <w:t>от</w:t>
+      </w:r>
+      <w:r>
+        <w:rPr>
+          <w:rFonts w:ascii="Times New Roman" w:hAnsi="Times New Roman" w:cs="Times New Roman"/>
+          <w:b/>
+          <w:bCs/>
+          <w:lang w:val="en-US"/>
+        </w:rPr>
+        <w:t xml:space="preserve"> </w:t>
+      </w:r>
+      <w:r>
+        <w:rPr>
+          <w:rFonts w:ascii="Times New Roman" w:hAnsi="Times New Roman" w:cs="Times New Roman"/>
+          <w:b/>
+          <w:bCs/>
+        </w:rPr>
+        <w:t>задания</w:t>
+      </w:r>
+      <w:r>
+        <w:rPr>
+          <w:rFonts w:ascii="Times New Roman" w:hAnsi="Times New Roman" w:cs="Times New Roman"/>
+          <w:b/>
+          <w:bCs/>
+          <w:lang w:val="en-US"/>
+        </w:rPr>
+        <w:t>:</w:t>
+      </w:r>
+    </w:p>
+    <w:p>
+      <w:pPr>
+        <w:spacing w:after="160" w:line="259" w:lineRule="auto"/>
+        <w:rPr>
+          <w:rFonts w:ascii="Times New Roman" w:hAnsi="Times New Roman" w:cs="Times New Roman"/>
+          <w:lang w:val="en-US"/>
+        </w:rPr>
+      </w:pPr>
+      <w:r>
+        <w:rPr>
+          <w:rFonts w:ascii="Times New Roman" w:hAnsi="Times New Roman" w:cs="Times New Roman"/>
+          <w:lang w:val="en-US"/>
+        </w:rPr>
+        <w:t xml:space="preserve">program </w:t>
+      </w:r>
+      <w:proofErr w:type="spellStart"/>
+      <w:r>
+        <w:rPr>
+          <w:rFonts w:ascii="Times New Roman" w:hAnsi="Times New Roman" w:cs="Times New Roman"/>
+          <w:lang w:val="en-US"/>
+        </w:rPr>
+        <w:t>CountChar</w:t>
+      </w:r>
+      <w:proofErr w:type="spellEnd"/>
+      <w:r>
+        <w:rPr>
+          <w:rFonts w:ascii="Times New Roman" w:hAnsi="Times New Roman" w:cs="Times New Roman"/>
+          <w:lang w:val="en-US"/>
+        </w:rPr>
+        <w:t>;</w:t>
+      </w:r>
+    </w:p>
+    <w:p>
+      <w:pPr>
+        <w:spacing w:after="160" w:line="259" w:lineRule="auto"/>
+        <w:rPr>
+          <w:rFonts w:ascii="Times New Roman" w:hAnsi="Times New Roman" w:cs="Times New Roman"/>
+          <w:lang w:val="en-US"/>
+        </w:rPr>
+      </w:pPr>
+    </w:p>
+    <w:p>
+      <w:pPr>
+        <w:spacing w:after="160" w:line="259" w:lineRule="auto"/>
+        <w:rPr>
+          <w:rFonts w:ascii="Times New Roman" w:hAnsi="Times New Roman" w:cs="Times New Roman"/>
+          <w:lang w:val="en-US"/>
+        </w:rPr>
+      </w:pPr>
+      <w:r>
+        <w:rPr>
+          <w:rFonts w:ascii="Times New Roman" w:hAnsi="Times New Roman" w:cs="Times New Roman"/>
+          <w:lang w:val="en-US"/>
+        </w:rPr>
+        <w:t>var</w:t>
+      </w:r>
+    </w:p>
+    <w:p>
+      <w:pPr>
+        <w:spacing w:after="160" w:line="259" w:lineRule="auto"/>
+        <w:rPr>
+          <w:rFonts w:ascii="Times New Roman" w:hAnsi="Times New Roman" w:cs="Times New Roman"/>
+          <w:lang w:val="en-US"/>
+        </w:rPr>
+      </w:pPr>
+      <w:r>
+        <w:rPr>
+          <w:rFonts w:ascii="Times New Roman" w:hAnsi="Times New Roman" w:cs="Times New Roman"/>
+          <w:lang w:val="en-US"/>
+        </w:rPr>
+        <w:t xml:space="preserve">  </w:t>
+      </w:r>
+      <w:proofErr w:type="spellStart"/>
+      <w:r>
+        <w:rPr>
+          <w:rFonts w:ascii="Times New Roman" w:hAnsi="Times New Roman" w:cs="Times New Roman"/>
+          <w:lang w:val="en-US"/>
+        </w:rPr>
+        <w:t>LenSTR</w:t>
+      </w:r>
+      <w:proofErr w:type="spellEnd"/>
+      <w:r>
+        <w:rPr>
+          <w:rFonts w:ascii="Times New Roman" w:hAnsi="Times New Roman" w:cs="Times New Roman"/>
+          <w:lang w:val="en-US"/>
+        </w:rPr>
+        <w:t>: string;</w:t>
+      </w:r>
+    </w:p>
+    <w:p>
+      <w:pPr>
+        <w:spacing w:after="160" w:line="259" w:lineRule="auto"/>
+        <w:rPr>
+          <w:rFonts w:ascii="Times New Roman" w:hAnsi="Times New Roman" w:cs="Times New Roman"/>
+          <w:lang w:val="en-US"/>
+        </w:rPr>
+      </w:pPr>
+      <w:r>
+        <w:rPr>
+          <w:rFonts w:ascii="Times New Roman" w:hAnsi="Times New Roman" w:cs="Times New Roman"/>
+          <w:lang w:val="en-US"/>
+        </w:rPr>
+        <w:t xml:space="preserve">  </w:t>
+      </w:r>
+      <w:r>
+        <w:rPr>
+          <w:rFonts w:ascii="Times New Roman" w:hAnsi="Times New Roman" w:cs="Times New Roman"/>
+          <w:lang w:val="en-US"/>
+        </w:rPr>
+        <w:t>STR(</w:t>
+      </w:r>
+      <w:proofErr w:type="spellStart"/>
+      <w:r>
+        <w:rPr>
+          <w:rFonts w:ascii="Times New Roman" w:hAnsi="Times New Roman" w:cs="Times New Roman"/>
+          <w:lang w:val="en-US"/>
+        </w:rPr>
+        <w:t>i</w:t>
+      </w:r>
+      <w:proofErr w:type="spellEnd"/>
+      <w:r>
+        <w:rPr>
+          <w:rFonts w:ascii="Times New Roman" w:hAnsi="Times New Roman" w:cs="Times New Roman"/>
+          <w:lang w:val="en-US"/>
+        </w:rPr>
+        <w:t>)</w:t>
+      </w:r>
+      <w:r>
+        <w:rPr>
+          <w:rFonts w:ascii="Times New Roman" w:hAnsi="Times New Roman" w:cs="Times New Roman"/>
+          <w:lang w:val="en-US"/>
+        </w:rPr>
+        <w:t>: char;</w:t>
+      </w:r>
+    </w:p>
+    <w:p>
+      <w:pPr>
+        <w:spacing w:after="160" w:line="259" w:lineRule="auto"/>
+        <w:rPr>
+          <w:rFonts w:ascii="Times New Roman" w:hAnsi="Times New Roman" w:cs="Times New Roman"/>
+          <w:lang w:val="en-US"/>
+        </w:rPr>
+      </w:pPr>
+      <w:r>
+        <w:rPr>
+          <w:rFonts w:ascii="Times New Roman" w:hAnsi="Times New Roman" w:cs="Times New Roman"/>
+          <w:lang w:val="en-US"/>
+        </w:rPr>
+        <w:t xml:space="preserve">  </w:t>
+      </w:r>
+      <w:proofErr w:type="spellStart"/>
+      <w:r>
+        <w:rPr>
+          <w:rFonts w:ascii="Times New Roman" w:hAnsi="Times New Roman" w:cs="Times New Roman"/>
+          <w:lang w:val="en-US"/>
+        </w:rPr>
+        <w:t>i</w:t>
+      </w:r>
+      <w:proofErr w:type="spellEnd"/>
+      <w:r>
+        <w:rPr>
+          <w:rFonts w:ascii="Times New Roman" w:hAnsi="Times New Roman" w:cs="Times New Roman"/>
+          <w:lang w:val="en-US"/>
+        </w:rPr>
+        <w:t xml:space="preserve">, </w:t>
+      </w:r>
+      <w:r>
+        <w:rPr>
+          <w:rFonts w:ascii="Times New Roman" w:hAnsi="Times New Roman" w:cs="Times New Roman"/>
+          <w:lang w:val="en-US"/>
+        </w:rPr>
+        <w:t>S</w:t>
+      </w:r>
+      <w:r>
+        <w:rPr>
+          <w:rFonts w:ascii="Times New Roman" w:hAnsi="Times New Roman" w:cs="Times New Roman"/>
+          <w:lang w:val="en-US"/>
+        </w:rPr>
+        <w:t>: integer;</w:t>
+      </w:r>
+    </w:p>
+    <w:p>
+      <w:pPr>
+        <w:spacing w:after="160" w:line="259" w:lineRule="auto"/>
+        <w:rPr>
+          <w:rFonts w:ascii="Times New Roman" w:hAnsi="Times New Roman" w:cs="Times New Roman"/>
+          <w:lang w:val="en-US"/>
+        </w:rPr>
+      </w:pPr>
+    </w:p>
+    <w:p>
+      <w:pPr>
+        <w:spacing w:after="160" w:line="259" w:lineRule="auto"/>
+        <w:rPr>
+          <w:rFonts w:ascii="Times New Roman" w:hAnsi="Times New Roman" w:cs="Times New Roman"/>
+          <w:lang w:val="en-US"/>
+        </w:rPr>
+      </w:pPr>
+      <w:r>
+        <w:rPr>
+          <w:rFonts w:ascii="Times New Roman" w:hAnsi="Times New Roman" w:cs="Times New Roman"/>
+          <w:lang w:val="en-US"/>
+        </w:rPr>
+        <w:t>begin</w:t>
+      </w:r>
+    </w:p>
+    <w:p>
+      <w:pPr>
+        <w:spacing w:after="160" w:line="259" w:lineRule="auto"/>
+        <w:rPr>
+          <w:rFonts w:ascii="Times New Roman" w:hAnsi="Times New Roman" w:cs="Times New Roman"/>
+          <w:lang w:val="en-US"/>
+        </w:rPr>
+      </w:pPr>
+      <w:r>
+        <w:rPr>
+          <w:rFonts w:ascii="Times New Roman" w:hAnsi="Times New Roman" w:cs="Times New Roman"/>
+          <w:lang w:val="en-US"/>
+        </w:rPr>
+        <w:t xml:space="preserve">  </w:t>
+      </w:r>
+      <w:proofErr w:type="gramStart"/>
+      <w:r>
+        <w:rPr>
+          <w:rFonts w:ascii="Times New Roman" w:hAnsi="Times New Roman" w:cs="Times New Roman"/>
+          <w:lang w:val="en-US"/>
+        </w:rPr>
+        <w:t xml:space="preserve">{ </w:t>
+      </w:r>
+      <w:r>
+        <w:rPr>
+          <w:rFonts w:ascii="Times New Roman" w:hAnsi="Times New Roman" w:cs="Times New Roman"/>
+        </w:rPr>
+        <w:t>Ввод</w:t>
+      </w:r>
+      <w:proofErr w:type="gramEnd"/>
+      <w:r>
+        <w:rPr>
+          <w:rFonts w:ascii="Times New Roman" w:hAnsi="Times New Roman" w:cs="Times New Roman"/>
+          <w:lang w:val="en-US"/>
+        </w:rPr>
+        <w:t xml:space="preserve"> </w:t>
+      </w:r>
+      <w:r>
+        <w:rPr>
+          <w:rFonts w:ascii="Times New Roman" w:hAnsi="Times New Roman" w:cs="Times New Roman"/>
+        </w:rPr>
+        <w:t>строки</w:t>
+      </w:r>
+      <w:r>
+        <w:rPr>
+          <w:rFonts w:ascii="Times New Roman" w:hAnsi="Times New Roman" w:cs="Times New Roman"/>
+          <w:lang w:val="en-US"/>
+        </w:rPr>
+        <w:t xml:space="preserve"> }</w:t>
+      </w:r>
+    </w:p>
+    <w:p>
+      <w:pPr>
+        <w:spacing w:after="160" w:line="259" w:lineRule="auto"/>
+        <w:rPr>
+          <w:rFonts w:ascii="Times New Roman" w:hAnsi="Times New Roman" w:cs="Times New Roman"/>
+        </w:rPr>
+      </w:pPr>
+      <w:r>
+        <w:rPr>
+          <w:rFonts w:ascii="Times New Roman" w:hAnsi="Times New Roman" w:cs="Times New Roman"/>
+          <w:lang w:val="en-US"/>
+        </w:rPr>
+        <w:t xml:space="preserve">  </w:t>
+      </w:r>
+      <w:proofErr w:type="spellStart"/>
+      <w:proofErr w:type="gramStart"/>
+      <w:r>
+        <w:rPr>
+          <w:rFonts w:ascii="Times New Roman" w:hAnsi="Times New Roman" w:cs="Times New Roman"/>
+          <w:lang w:val="en-US"/>
+        </w:rPr>
+        <w:t>readln</w:t>
+      </w:r>
+      <w:proofErr w:type="spellEnd"/>
+      <w:r>
+        <w:rPr>
+          <w:rFonts w:ascii="Times New Roman" w:hAnsi="Times New Roman" w:cs="Times New Roman"/>
+        </w:rPr>
+        <w:t>(</w:t>
+      </w:r>
+      <w:proofErr w:type="spellStart"/>
+      <w:proofErr w:type="gramEnd"/>
+      <w:r>
+        <w:rPr>
+          <w:rFonts w:ascii="Times New Roman" w:hAnsi="Times New Roman" w:cs="Times New Roman"/>
+          <w:lang w:val="en-US"/>
+        </w:rPr>
+        <w:t>LenSTR</w:t>
+      </w:r>
+      <w:proofErr w:type="spellEnd"/>
+      <w:r>
+        <w:rPr>
+          <w:rFonts w:ascii="Times New Roman" w:hAnsi="Times New Roman" w:cs="Times New Roman"/>
+        </w:rPr>
+        <w:t>);</w:t>
+      </w:r>
+    </w:p>
+    <w:p>
+      <w:pPr>
+        <w:spacing w:after="160" w:line="259" w:lineRule="auto"/>
+        <w:rPr>
+          <w:rFonts w:ascii="Times New Roman" w:hAnsi="Times New Roman" w:cs="Times New Roman"/>
+        </w:rPr>
+      </w:pPr>
+    </w:p>
+    <w:p>
+      <w:pPr>
+        <w:spacing w:after="160" w:line="259" w:lineRule="auto"/>
+        <w:rPr>
+          <w:rFonts w:ascii="Times New Roman" w:hAnsi="Times New Roman" w:cs="Times New Roman"/>
+        </w:rPr>
+      </w:pPr>
+      <w:r>
+        <w:rPr>
+          <w:rFonts w:ascii="Times New Roman" w:hAnsi="Times New Roman" w:cs="Times New Roman"/>
+        </w:rPr>
+        <w:t xml:space="preserve">  </w:t>
+      </w:r>
+      <w:proofErr w:type="gramStart"/>
+      <w:r>
+        <w:rPr>
+          <w:rFonts w:ascii="Times New Roman" w:hAnsi="Times New Roman" w:cs="Times New Roman"/>
+        </w:rPr>
+        <w:t>{ Ввод</w:t>
+      </w:r>
+      <w:proofErr w:type="gramEnd"/>
+      <w:r>
+        <w:rPr>
+          <w:rFonts w:ascii="Times New Roman" w:hAnsi="Times New Roman" w:cs="Times New Roman"/>
+        </w:rPr>
+        <w:t xml:space="preserve"> эталонного символа (первый символ введённой строки) }</w:t>
+      </w:r>
+    </w:p>
+    <w:p>
+      <w:pPr>
+        <w:spacing w:after="160" w:line="259" w:lineRule="auto"/>
+        <w:rPr>
+          <w:rFonts w:ascii="Times New Roman" w:hAnsi="Times New Roman" w:cs="Times New Roman"/>
+          <w:lang w:val="en-US"/>
+        </w:rPr>
+      </w:pPr>
+      <w:r>
+        <w:rPr>
+          <w:rFonts w:ascii="Times New Roman" w:hAnsi="Times New Roman" w:cs="Times New Roman"/>
+        </w:rPr>
+        <w:t xml:space="preserve">  </w:t>
+      </w:r>
+      <w:proofErr w:type="spellStart"/>
+      <w:proofErr w:type="gramStart"/>
+      <w:r>
+        <w:rPr>
+          <w:rFonts w:ascii="Times New Roman" w:hAnsi="Times New Roman" w:cs="Times New Roman"/>
+          <w:lang w:val="en-US"/>
+        </w:rPr>
+        <w:t>readln</w:t>
+      </w:r>
+      <w:proofErr w:type="spellEnd"/>
+      <w:r>
+        <w:rPr>
+          <w:rFonts w:ascii="Times New Roman" w:hAnsi="Times New Roman" w:cs="Times New Roman"/>
+          <w:lang w:val="en-US"/>
+        </w:rPr>
+        <w:t>(</w:t>
+      </w:r>
+      <w:proofErr w:type="gramEnd"/>
+      <w:r>
+        <w:rPr>
+          <w:rFonts w:ascii="Times New Roman" w:hAnsi="Times New Roman" w:cs="Times New Roman"/>
+          <w:lang w:val="en-US"/>
+        </w:rPr>
+        <w:t>STR(</w:t>
+      </w:r>
+      <w:proofErr w:type="spellStart"/>
+      <w:r>
+        <w:rPr>
+          <w:rFonts w:ascii="Times New Roman" w:hAnsi="Times New Roman" w:cs="Times New Roman"/>
+          <w:lang w:val="en-US"/>
+        </w:rPr>
+        <w:t>i</w:t>
+      </w:r>
+      <w:proofErr w:type="spellEnd"/>
+      <w:r>
+        <w:rPr>
+          <w:rFonts w:ascii="Times New Roman" w:hAnsi="Times New Roman" w:cs="Times New Roman"/>
+          <w:lang w:val="en-US"/>
+        </w:rPr>
+        <w:t>)</w:t>
+      </w:r>
+      <w:r>
+        <w:rPr>
+          <w:rFonts w:ascii="Times New Roman" w:hAnsi="Times New Roman" w:cs="Times New Roman"/>
+          <w:lang w:val="en-US"/>
+        </w:rPr>
+        <w:t>);</w:t>
+      </w:r>
+    </w:p>
+    <w:p>
+      <w:pPr>
+        <w:spacing w:after="160" w:line="259" w:lineRule="auto"/>
+        <w:rPr>
+          <w:rFonts w:ascii="Times New Roman" w:hAnsi="Times New Roman" w:cs="Times New Roman"/>
+          <w:lang w:val="en-US"/>
+        </w:rPr>
+      </w:pPr>
+      <w:proofErr w:type="spellStart"/>
+      <w:proofErr w:type="gramStart"/>
+      <w:r>
+        <w:rPr>
+          <w:rFonts w:ascii="Times New Roman" w:hAnsi="Times New Roman" w:cs="Times New Roman"/>
+          <w:lang w:val="en-US"/>
+        </w:rPr>
+        <w:t>LenSTR</w:t>
+      </w:r>
+      <w:proofErr w:type="spellEnd"/>
+      <w:r>
+        <w:rPr>
+          <w:rFonts w:ascii="Times New Roman" w:hAnsi="Times New Roman" w:cs="Times New Roman"/>
+          <w:lang w:val="en-US"/>
+        </w:rPr>
+        <w:t>:</w:t>
+      </w:r>
+      <w:r>
+        <w:rPr>
+          <w:rFonts w:ascii="Times New Roman" w:hAnsi="Times New Roman" w:cs="Times New Roman"/>
+          <w:lang w:val="en-US"/>
+        </w:rPr>
+        <w:t>=</w:t>
+      </w:r>
+      <w:proofErr w:type="gramEnd"/>
+      <w:r>
+        <w:rPr>
+          <w:rFonts w:ascii="Times New Roman" w:hAnsi="Times New Roman" w:cs="Times New Roman"/>
+          <w:lang w:val="en-US"/>
+        </w:rPr>
+        <w:t>0;</w:t>
+      </w:r>
+    </w:p>
+    <w:p>
+      <w:pPr>
+        <w:spacing w:after="160" w:line="259" w:lineRule="auto"/>
+        <w:rPr>
+          <w:rFonts w:ascii="Times New Roman" w:hAnsi="Times New Roman" w:cs="Times New Roman"/>
+          <w:lang w:val="en-US"/>
+        </w:rPr>
+      </w:pPr>
+      <w:proofErr w:type="gramStart"/>
+      <w:r>
+        <w:rPr>
+          <w:rFonts w:ascii="Times New Roman" w:hAnsi="Times New Roman" w:cs="Times New Roman"/>
+          <w:lang w:val="en-US"/>
+        </w:rPr>
+        <w:t>i</w:t>
+      </w:r>
+      <w:r>
+        <w:rPr>
+          <w:rFonts w:ascii="Times New Roman" w:hAnsi="Times New Roman" w:cs="Times New Roman"/>
+          <w:lang w:val="en-US"/>
+        </w:rPr>
+        <w:t>:</w:t>
+      </w:r>
+      <w:r>
+        <w:rPr>
+          <w:rFonts w:ascii="Times New Roman" w:hAnsi="Times New Roman" w:cs="Times New Roman"/>
+          <w:lang w:val="en-US"/>
+        </w:rPr>
+        <w:t>=</w:t>
+      </w:r>
+      <w:proofErr w:type="gramEnd"/>
+      <w:r>
+        <w:rPr>
+          <w:rFonts w:ascii="Times New Roman" w:hAnsi="Times New Roman" w:cs="Times New Roman"/>
+          <w:lang w:val="en-US"/>
+        </w:rPr>
+        <w:t>1;</w:t>
+      </w:r>
+    </w:p>
+    <w:p>
+      <w:pPr>
+        <w:spacing w:after="160" w:line="259" w:lineRule="auto"/>
+        <w:rPr>
+          <w:rFonts w:ascii="Times New Roman" w:hAnsi="Times New Roman" w:cs="Times New Roman"/>
+          <w:lang w:val="en-US"/>
+        </w:rPr>
+      </w:pPr>
+      <w:r>
+        <w:rPr>
+          <w:rFonts w:ascii="Times New Roman" w:hAnsi="Times New Roman" w:cs="Times New Roman"/>
+          <w:lang w:val="en-US"/>
+        </w:rPr>
+        <w:t>if (STR(</w:t>
+      </w:r>
+      <w:proofErr w:type="spellStart"/>
+      <w:r>
+        <w:rPr>
+          <w:rFonts w:ascii="Times New Roman" w:hAnsi="Times New Roman" w:cs="Times New Roman"/>
+          <w:lang w:val="en-US"/>
+        </w:rPr>
+        <w:t>i</w:t>
+      </w:r>
+      <w:proofErr w:type="spellEnd"/>
+      <w:r>
+        <w:rPr>
+          <w:rFonts w:ascii="Times New Roman" w:hAnsi="Times New Roman" w:cs="Times New Roman"/>
+          <w:lang w:val="en-US"/>
+        </w:rPr>
+        <w:t>)=</w:t>
+      </w:r>
+      <w:proofErr w:type="gramStart"/>
+      <w:r>
+        <w:rPr>
+          <w:rFonts w:ascii="Times New Roman" w:hAnsi="Times New Roman" w:cs="Times New Roman"/>
+          <w:lang w:val="en-US"/>
+        </w:rPr>
+        <w:t>#){</w:t>
+      </w:r>
+      <w:proofErr w:type="gramEnd"/>
+    </w:p>
+    <w:p>
+      <w:pPr>
+        <w:spacing w:after="160" w:line="259" w:lineRule="auto"/>
+        <w:rPr>
+          <w:rFonts w:ascii="Times New Roman" w:hAnsi="Times New Roman" w:cs="Times New Roman"/>
+          <w:lang w:val="en-US"/>
+        </w:rPr>
+      </w:pPr>
+      <w:r>
+        <w:rPr>
+          <w:rFonts w:ascii="Times New Roman" w:hAnsi="Times New Roman" w:cs="Times New Roman"/>
+          <w:lang w:val="en-US"/>
+        </w:rPr>
+        <w:t>end} else {</w:t>
+      </w:r>
+      <w:proofErr w:type="spellStart"/>
+      <w:proofErr w:type="gramStart"/>
+      <w:r>
+        <w:rPr>
+          <w:rFonts w:ascii="Times New Roman" w:hAnsi="Times New Roman" w:cs="Times New Roman"/>
+          <w:lang w:val="en-US"/>
+        </w:rPr>
+        <w:t>LenSTR</w:t>
+      </w:r>
+      <w:proofErr w:type="spellEnd"/>
+      <w:r>
+        <w:rPr>
+          <w:rFonts w:ascii="Times New Roman" w:hAnsi="Times New Roman" w:cs="Times New Roman"/>
+          <w:lang w:val="en-US"/>
+        </w:rPr>
+        <w:t>:</w:t>
+      </w:r>
+      <w:r>
+        <w:rPr>
+          <w:rFonts w:ascii="Times New Roman" w:hAnsi="Times New Roman" w:cs="Times New Roman"/>
+          <w:lang w:val="en-US"/>
+        </w:rPr>
+        <w:t>=</w:t>
+      </w:r>
+      <w:proofErr w:type="gramEnd"/>
+      <w:r>
+        <w:rPr>
+          <w:rFonts w:ascii="Times New Roman" w:hAnsi="Times New Roman" w:cs="Times New Roman"/>
+          <w:lang w:val="en-US"/>
+        </w:rPr>
+        <w:t>LenSTR+1;</w:t>
+      </w:r>
+    </w:p>
+    <w:p>
+      <w:pPr>
+        <w:spacing w:after="160" w:line="259" w:lineRule="auto"/>
+        <w:rPr>
+          <w:rFonts w:ascii="Times New Roman" w:hAnsi="Times New Roman" w:cs="Times New Roman"/>
+          <w:lang w:val="en-US"/>
+        </w:rPr>
+      </w:pPr>
+      <w:proofErr w:type="gramStart"/>
+      <w:r>
+        <w:rPr>
+          <w:rFonts w:ascii="Times New Roman" w:hAnsi="Times New Roman" w:cs="Times New Roman"/>
+          <w:lang w:val="en-US"/>
+        </w:rPr>
+        <w:t>i</w:t>
+      </w:r>
+      <w:r>
+        <w:rPr>
+          <w:rFonts w:ascii="Times New Roman" w:hAnsi="Times New Roman" w:cs="Times New Roman"/>
+          <w:lang w:val="en-US"/>
+        </w:rPr>
+        <w:t>:</w:t>
+      </w:r>
+      <w:r>
+        <w:rPr>
+          <w:rFonts w:ascii="Times New Roman" w:hAnsi="Times New Roman" w:cs="Times New Roman"/>
+          <w:lang w:val="en-US"/>
+        </w:rPr>
+        <w:t>=</w:t>
+      </w:r>
+      <w:proofErr w:type="gramEnd"/>
+      <w:r>
+        <w:rPr>
+          <w:rFonts w:ascii="Times New Roman" w:hAnsi="Times New Roman" w:cs="Times New Roman"/>
+          <w:lang w:val="en-US"/>
+        </w:rPr>
+        <w:t>i+1;}</w:t>
+      </w:r>
+    </w:p>
+    <w:p>
+      <w:pPr>
+        <w:spacing w:after="160" w:line="259" w:lineRule="auto"/>
+        <w:rPr>
+          <w:rFonts w:ascii="Times New Roman" w:hAnsi="Times New Roman" w:cs="Times New Roman"/>
+          <w:lang w:val="en-US"/>
+        </w:rPr>
+      </w:pPr>
+    </w:p>
+    <w:p>
+      <w:pPr>
+        <w:spacing w:after="160" w:line="259" w:lineRule="auto"/>
+        <w:rPr>
+          <w:rFonts w:ascii="Times New Roman" w:hAnsi="Times New Roman" w:cs="Times New Roman"/>
+          <w:lang w:val="en-US"/>
+        </w:rPr>
+      </w:pPr>
+      <w:r>
+        <w:rPr>
+          <w:rFonts w:ascii="Times New Roman" w:hAnsi="Times New Roman" w:cs="Times New Roman"/>
+          <w:lang w:val="en-US"/>
+        </w:rPr>
+        <w:t xml:space="preserve">  </w:t>
+      </w:r>
+      <w:proofErr w:type="gramStart"/>
+      <w:r>
+        <w:rPr>
+          <w:rFonts w:ascii="Times New Roman" w:hAnsi="Times New Roman" w:cs="Times New Roman"/>
+          <w:lang w:val="en-US"/>
+        </w:rPr>
+        <w:t>S</w:t>
+      </w:r>
+      <w:r>
+        <w:rPr>
+          <w:rFonts w:ascii="Times New Roman" w:hAnsi="Times New Roman" w:cs="Times New Roman"/>
+          <w:lang w:val="en-US"/>
+        </w:rPr>
+        <w:t xml:space="preserve"> :</w:t>
+      </w:r>
+      <w:proofErr w:type="gramEnd"/>
+      <w:r>
+        <w:rPr>
+          <w:rFonts w:ascii="Times New Roman" w:hAnsi="Times New Roman" w:cs="Times New Roman"/>
+          <w:lang w:val="en-US"/>
+        </w:rPr>
+        <w:t>= 0;</w:t>
+      </w:r>
+    </w:p>
+    <w:p>
+      <w:pPr>
+        <w:spacing w:after="160" w:line="259" w:lineRule="auto"/>
+        <w:rPr>
+          <w:rFonts w:ascii="Times New Roman" w:hAnsi="Times New Roman" w:cs="Times New Roman"/>
+          <w:lang w:val="en-US"/>
+        </w:rPr>
+      </w:pPr>
+      <w:proofErr w:type="gramStart"/>
+      <w:r>
+        <w:rPr>
+          <w:rFonts w:ascii="Times New Roman" w:hAnsi="Times New Roman" w:cs="Times New Roman"/>
+          <w:lang w:val="en-US"/>
+        </w:rPr>
+        <w:t>i</w:t>
+      </w:r>
+      <w:r>
+        <w:rPr>
+          <w:rFonts w:ascii="Times New Roman" w:hAnsi="Times New Roman" w:cs="Times New Roman"/>
+          <w:lang w:val="en-US"/>
+        </w:rPr>
+        <w:t>:</w:t>
+      </w:r>
+      <w:r>
+        <w:rPr>
+          <w:rFonts w:ascii="Times New Roman" w:hAnsi="Times New Roman" w:cs="Times New Roman"/>
+          <w:lang w:val="en-US"/>
+        </w:rPr>
+        <w:t>=</w:t>
+      </w:r>
+      <w:proofErr w:type="gramEnd"/>
+      <w:r>
+        <w:rPr>
+          <w:rFonts w:ascii="Times New Roman" w:hAnsi="Times New Roman" w:cs="Times New Roman"/>
+          <w:lang w:val="en-US"/>
+        </w:rPr>
+        <w:t>1;</w:t>
+      </w:r>
+    </w:p>
+    <w:p>
+      <w:pPr>
+        <w:spacing w:after="160" w:line="259" w:lineRule="auto"/>
+        <w:rPr>
+          <w:rFonts w:ascii="Times New Roman" w:hAnsi="Times New Roman" w:cs="Times New Roman"/>
+          <w:lang w:val="en-US"/>
+        </w:rPr>
+      </w:pPr>
+      <w:r>
+        <w:rPr>
+          <w:rFonts w:ascii="Times New Roman" w:hAnsi="Times New Roman" w:cs="Times New Roman"/>
+          <w:lang w:val="en-US"/>
+        </w:rPr>
+        <w:t xml:space="preserve">  for </w:t>
+      </w:r>
+      <w:proofErr w:type="spellStart"/>
+      <w:proofErr w:type="gramStart"/>
+      <w:r>
+        <w:rPr>
+          <w:rFonts w:ascii="Times New Roman" w:hAnsi="Times New Roman" w:cs="Times New Roman"/>
+          <w:lang w:val="en-US"/>
+        </w:rPr>
+        <w:t>i</w:t>
+      </w:r>
+      <w:proofErr w:type="spellEnd"/>
+      <w:r>
+        <w:rPr>
+          <w:rFonts w:ascii="Times New Roman" w:hAnsi="Times New Roman" w:cs="Times New Roman"/>
+          <w:lang w:val="en-US"/>
+        </w:rPr>
+        <w:t xml:space="preserve"> :</w:t>
+      </w:r>
+      <w:proofErr w:type="gramEnd"/>
+      <w:r>
+        <w:rPr>
+          <w:rFonts w:ascii="Times New Roman" w:hAnsi="Times New Roman" w:cs="Times New Roman"/>
+          <w:lang w:val="en-US"/>
+        </w:rPr>
+        <w:t>= 1 to length(</w:t>
+      </w:r>
+      <w:proofErr w:type="spellStart"/>
+      <w:r>
+        <w:rPr>
+          <w:rFonts w:ascii="Times New Roman" w:hAnsi="Times New Roman" w:cs="Times New Roman"/>
+          <w:lang w:val="en-US"/>
+        </w:rPr>
+        <w:t>LenSTR</w:t>
+      </w:r>
+      <w:proofErr w:type="spellEnd"/>
+      <w:r>
+        <w:rPr>
+          <w:rFonts w:ascii="Times New Roman" w:hAnsi="Times New Roman" w:cs="Times New Roman"/>
+          <w:lang w:val="en-US"/>
+        </w:rPr>
+        <w:t>) do</w:t>
+      </w:r>
+    </w:p>
+    <w:p>
+      <w:pPr>
+        <w:spacing w:after="160" w:line="259" w:lineRule="auto"/>
+        <w:rPr>
+          <w:rFonts w:ascii="Times New Roman" w:hAnsi="Times New Roman" w:cs="Times New Roman"/>
+          <w:lang w:val="en-US"/>
+        </w:rPr>
+      </w:pPr>
+      <w:r>
+        <w:rPr>
+          <w:rFonts w:ascii="Times New Roman" w:hAnsi="Times New Roman" w:cs="Times New Roman"/>
+          <w:lang w:val="en-US"/>
+        </w:rPr>
+        <w:t xml:space="preserve">    if </w:t>
+      </w:r>
+      <w:r>
+        <w:rPr>
+          <w:rFonts w:ascii="Times New Roman" w:hAnsi="Times New Roman" w:cs="Times New Roman"/>
+          <w:lang w:val="en-US"/>
+        </w:rPr>
+        <w:t>(</w:t>
+      </w:r>
+      <w:proofErr w:type="spellStart"/>
+      <w:r>
+        <w:rPr>
+          <w:rFonts w:ascii="Times New Roman" w:hAnsi="Times New Roman" w:cs="Times New Roman"/>
+          <w:lang w:val="en-US"/>
+        </w:rPr>
+        <w:t>LenSTR</w:t>
+      </w:r>
+      <w:proofErr w:type="spellEnd"/>
+      <w:r>
+        <w:rPr>
+          <w:rFonts w:ascii="Times New Roman" w:hAnsi="Times New Roman" w:cs="Times New Roman"/>
+          <w:lang w:val="en-US"/>
+        </w:rPr>
+        <w:t>[</w:t>
+      </w:r>
+      <w:proofErr w:type="spellStart"/>
+      <w:r>
+        <w:rPr>
+          <w:rFonts w:ascii="Times New Roman" w:hAnsi="Times New Roman" w:cs="Times New Roman"/>
+          <w:lang w:val="en-US"/>
+        </w:rPr>
+        <w:t>i</w:t>
+      </w:r>
+      <w:proofErr w:type="spellEnd"/>
+      <w:r>
+        <w:rPr>
+          <w:rFonts w:ascii="Times New Roman" w:hAnsi="Times New Roman" w:cs="Times New Roman"/>
+          <w:lang w:val="en-US"/>
+        </w:rPr>
+        <w:t>] =</w:t>
+      </w:r>
+      <w:r>
+        <w:rPr>
+          <w:rFonts w:ascii="Times New Roman" w:hAnsi="Times New Roman" w:cs="Times New Roman"/>
+          <w:lang w:val="en-US"/>
+        </w:rPr>
+        <w:t>&gt;</w:t>
+      </w:r>
+      <w:r>
+        <w:rPr>
+          <w:rFonts w:ascii="Times New Roman" w:hAnsi="Times New Roman" w:cs="Times New Roman"/>
+          <w:lang w:val="en-US"/>
+        </w:rPr>
+        <w:t xml:space="preserve"> </w:t>
+      </w:r>
+      <w:proofErr w:type="spellStart"/>
+      <w:proofErr w:type="gramStart"/>
+      <w:r>
+        <w:rPr>
+          <w:rFonts w:ascii="Times New Roman" w:hAnsi="Times New Roman" w:cs="Times New Roman"/>
+          <w:lang w:val="en-US"/>
+        </w:rPr>
+        <w:t>i</w:t>
+      </w:r>
+      <w:proofErr w:type="spellEnd"/>
+      <w:r>
+        <w:rPr>
+          <w:rFonts w:ascii="Times New Roman" w:hAnsi="Times New Roman" w:cs="Times New Roman"/>
+          <w:lang w:val="en-US"/>
+        </w:rPr>
+        <w:t>){</w:t>
+      </w:r>
+      <w:proofErr w:type="gramEnd"/>
+      <w:r>
+        <w:rPr>
+          <w:rFonts w:ascii="Times New Roman" w:hAnsi="Times New Roman" w:cs="Times New Roman"/>
+          <w:lang w:val="en-US"/>
+        </w:rPr>
+        <w:t>if (STR(</w:t>
+      </w:r>
+      <w:proofErr w:type="spellStart"/>
+      <w:r>
+        <w:rPr>
+          <w:rFonts w:ascii="Times New Roman" w:hAnsi="Times New Roman" w:cs="Times New Roman"/>
+          <w:lang w:val="en-US"/>
+        </w:rPr>
+        <w:t>i</w:t>
+      </w:r>
+      <w:proofErr w:type="spellEnd"/>
+      <w:r>
+        <w:rPr>
+          <w:rFonts w:ascii="Times New Roman" w:hAnsi="Times New Roman" w:cs="Times New Roman"/>
+          <w:lang w:val="en-US"/>
+        </w:rPr>
+        <w:t>)=E){S:=S+1} else {</w:t>
+      </w:r>
+      <w:proofErr w:type="spellStart"/>
+      <w:r>
+        <w:rPr>
+          <w:rFonts w:ascii="Times New Roman" w:hAnsi="Times New Roman" w:cs="Times New Roman"/>
+          <w:lang w:val="en-US"/>
+        </w:rPr>
+        <w:t>i</w:t>
+      </w:r>
+      <w:proofErr w:type="spellEnd"/>
+      <w:r>
+        <w:rPr>
+          <w:rFonts w:ascii="Times New Roman" w:hAnsi="Times New Roman" w:cs="Times New Roman"/>
+          <w:lang w:val="en-US"/>
+        </w:rPr>
+        <w:t>:=i+1}</w:t>
+      </w:r>
+      <w:r>
+        <w:rPr>
+          <w:rFonts w:ascii="Times New Roman" w:hAnsi="Times New Roman" w:cs="Times New Roman"/>
+          <w:lang w:val="en-US"/>
+        </w:rPr>
+        <w:t xml:space="preserve"> then</w:t>
+      </w:r>
+      <w:r>
+        <w:rPr>
+          <w:rFonts w:ascii="Times New Roman" w:hAnsi="Times New Roman" w:cs="Times New Roman"/>
+          <w:lang w:val="en-US"/>
+        </w:rPr>
+        <w:t xml:space="preserve"> </w:t>
+      </w:r>
+    </w:p>
+    <w:p>
+      <w:pPr>
+        <w:spacing w:after="160" w:line="259" w:lineRule="auto"/>
+        <w:rPr>
+          <w:rFonts w:ascii="Times New Roman" w:hAnsi="Times New Roman" w:cs="Times New Roman"/>
+          <w:lang w:val="en-US"/>
+        </w:rPr>
+      </w:pPr>
+      <w:r>
+        <w:rPr>
+          <w:rFonts w:ascii="Times New Roman" w:hAnsi="Times New Roman" w:cs="Times New Roman"/>
+          <w:lang w:val="en-US"/>
+        </w:rPr>
+        <w:t xml:space="preserve">      </w:t>
+      </w:r>
+      <w:proofErr w:type="spellStart"/>
+      <w:r>
+        <w:rPr>
+          <w:rFonts w:ascii="Times New Roman" w:hAnsi="Times New Roman" w:cs="Times New Roman"/>
+          <w:lang w:val="en-US"/>
+        </w:rPr>
+        <w:t>inc</w:t>
+      </w:r>
+      <w:proofErr w:type="spellEnd"/>
+      <w:r>
+        <w:rPr>
+          <w:rFonts w:ascii="Times New Roman" w:hAnsi="Times New Roman" w:cs="Times New Roman"/>
+          <w:lang w:val="en-US"/>
+        </w:rPr>
+        <w:t>(</w:t>
+      </w:r>
+      <w:r>
+        <w:rPr>
+          <w:rFonts w:ascii="Times New Roman" w:hAnsi="Times New Roman" w:cs="Times New Roman"/>
+          <w:lang w:val="en-US"/>
+        </w:rPr>
+        <w:t>S</w:t>
+      </w:r>
+      <w:r>
+        <w:rPr>
+          <w:rFonts w:ascii="Times New Roman" w:hAnsi="Times New Roman" w:cs="Times New Roman"/>
+          <w:lang w:val="en-US"/>
+        </w:rPr>
+        <w:t>);</w:t>
+      </w:r>
+    </w:p>
+    <w:p>
+      <w:pPr>
+        <w:spacing w:after="160" w:line="259" w:lineRule="auto"/>
+        <w:rPr>
+          <w:rFonts w:ascii="Times New Roman" w:hAnsi="Times New Roman" w:cs="Times New Roman"/>
+          <w:lang w:val="en-US"/>
+        </w:rPr>
+      </w:pPr>
+    </w:p>
+    <w:p>
+      <w:pPr>
+        <w:spacing w:after="160" w:line="259" w:lineRule="auto"/>
+        <w:rPr>
+          <w:rFonts w:ascii="Times New Roman" w:hAnsi="Times New Roman" w:cs="Times New Roman"/>
+          <w:lang w:val="en-US"/>
+        </w:rPr>
+      </w:pPr>
+      <w:r>
+        <w:rPr>
+          <w:rFonts w:ascii="Times New Roman" w:hAnsi="Times New Roman" w:cs="Times New Roman"/>
+          <w:lang w:val="en-US"/>
+        </w:rPr>
+        <w:t xml:space="preserve">  </w:t>
+      </w:r>
+      <w:proofErr w:type="spellStart"/>
+      <w:r>
+        <w:rPr>
+          <w:rFonts w:ascii="Times New Roman" w:hAnsi="Times New Roman" w:cs="Times New Roman"/>
+          <w:lang w:val="en-US"/>
+        </w:rPr>
+        <w:t>writeln</w:t>
+      </w:r>
+      <w:proofErr w:type="spellEnd"/>
+      <w:r>
+        <w:rPr>
+          <w:rFonts w:ascii="Times New Roman" w:hAnsi="Times New Roman" w:cs="Times New Roman"/>
+          <w:lang w:val="en-US"/>
+        </w:rPr>
+        <w:t>(</w:t>
+      </w:r>
+      <w:r>
+        <w:rPr>
+          <w:rFonts w:ascii="Times New Roman" w:hAnsi="Times New Roman" w:cs="Times New Roman"/>
+          <w:lang w:val="en-US"/>
+        </w:rPr>
+        <w:t>S</w:t>
+      </w:r>
+      <w:r>
+        <w:rPr>
+          <w:rFonts w:ascii="Times New Roman" w:hAnsi="Times New Roman" w:cs="Times New Roman"/>
+          <w:lang w:val="en-US"/>
+        </w:rPr>
+        <w:t>);</w:t>
+      </w:r>
+    </w:p>
+    <w:p>
+      <w:pPr>
+        <w:spacing w:after="160" w:line="259" w:lineRule="auto"/>
+        <w:rPr>
+          <w:rFonts w:ascii="Times New Roman" w:hAnsi="Times New Roman" w:cs="Times New Roman"/>
+          <w:lang w:val="en-US"/>
+        </w:rPr>
+      </w:pPr>
+      <w:r>
+        <w:rPr>
+          <w:rFonts w:ascii="Times New Roman" w:hAnsi="Times New Roman" w:cs="Times New Roman"/>
+          <w:lang w:val="en-US"/>
+        </w:rPr>
+        <w:t>end.</w:t>
+      </w:r>
+    </w:p>
+    <w:p>
+      <w:pPr>
+        <w:spacing w:after="160" w:line="259" w:lineRule="auto"/>
+        <w:rPr>
+          <w:rFonts w:ascii="Times New Roman" w:hAnsi="Times New Roman" w:cs="Times New Roman"/>
+          <w:lang w:val="en-US"/>
+        </w:rPr>
+      </w:pPr>
+      <w:r>
+        <w:rPr>
+          <w:rFonts w:ascii="Times New Roman" w:hAnsi="Times New Roman" w:cs="Times New Roman"/>
+          <w:lang w:val="en-US"/>
+        </w:rPr>
+        <w:br w:type="page"/>
+      </w:r>
+    </w:p>
+    <w:p>
+      <w:pPr>
+        <w:spacing w:after="160" w:line="259" w:lineRule="auto"/>
+        <w:rPr>
+          <w:rFonts w:ascii="Times New Roman" w:hAnsi="Times New Roman" w:cs="Times New Roman"/>
+          <w:b/>
+          <w:bCs/>
+        </w:rPr>
+      </w:pPr>
+      <w:r>
+        <w:rPr>
+          <w:rFonts w:ascii="Times New Roman" w:hAnsi="Times New Roman" w:cs="Times New Roman"/>
+          <w:b/>
+          <w:bCs/>
+        </w:rPr>
         <w:lastRenderedPageBreak/>
         <w:t>Приложение</w:t>
       </w:r>
@@ -2770,7 +3271,6 @@
       <w:r>
         <w:rPr>
           <w:rFonts w:ascii="Times New Roman" w:hAnsi="Times New Roman" w:cs="Times New Roman"/>
-          <w:lang w:val="en-US"/>
         </w:rPr>
         <w:t xml:space="preserve">1) </w:t>
       </w:r>
@@ -2788,6 +3288,7 @@
           <w:rFonts w:ascii="Times New Roman" w:hAnsi="Times New Roman" w:cs="Times New Roman"/>
         </w:rPr>
       </w:pPr>
+      <w:proofErr w:type="spellStart"/>
       <w:r>
         <w:rPr>
           <w:rFonts w:ascii="Times New Roman" w:hAnsi="Times New Roman" w:cs="Times New Roman"/>
@@ -2795,6 +3296,7 @@
         </w:rPr>
         <w:t>LenSTR</w:t>
       </w:r>
+      <w:proofErr w:type="spellEnd"/>
       <w:r>
         <w:rPr>
           <w:rFonts w:ascii="Times New Roman" w:hAnsi="Times New Roman" w:cs="Times New Roman"/>
@@ -2812,13 +3314,7 @@
         <w:rPr>
           <w:rFonts w:ascii="Times New Roman" w:hAnsi="Times New Roman" w:cs="Times New Roman"/>
         </w:rPr>
-        <w:t>;</w:t>
-      </w:r>
-      <w:r>
-        <w:rPr>
-          <w:rFonts w:ascii="Times New Roman" w:hAnsi="Times New Roman" w:cs="Times New Roman"/>
-        </w:rPr>
-        <w:t xml:space="preserve"> - строчная переменная, обозначающая длину строки</w:t>
+        <w:t>; - строчная переменная, обозначающая длину строки</w:t>
       </w:r>
     </w:p>
     <w:p>
@@ -2841,6 +3337,7 @@
         </w:rPr>
         <w:t>(</w:t>
       </w:r>
+      <w:proofErr w:type="spellStart"/>
       <w:r>
         <w:rPr>
           <w:rFonts w:ascii="Times New Roman" w:hAnsi="Times New Roman" w:cs="Times New Roman"/>
@@ -2848,6 +3345,7 @@
         </w:rPr>
         <w:t>i</w:t>
       </w:r>
+      <w:proofErr w:type="spellEnd"/>
       <w:r>
         <w:rPr>
           <w:rFonts w:ascii="Times New Roman" w:hAnsi="Times New Roman" w:cs="Times New Roman"/>
@@ -2865,13 +3363,7 @@
         <w:rPr>
           <w:rFonts w:ascii="Times New Roman" w:hAnsi="Times New Roman" w:cs="Times New Roman"/>
         </w:rPr>
-        <w:t>;</w:t>
-      </w:r>
-      <w:r>
-        <w:rPr>
-          <w:rFonts w:ascii="Times New Roman" w:hAnsi="Times New Roman" w:cs="Times New Roman"/>
-        </w:rPr>
-        <w:t xml:space="preserve"> - символьная переменная обозначающая ввод эталонного символа</w:t>
+        <w:t>; - символьная переменная обозначающая ввод эталонного символа</w:t>
       </w:r>
     </w:p>
     <w:p>
@@ -2881,6 +3373,7 @@
           <w:rFonts w:ascii="Times New Roman" w:hAnsi="Times New Roman" w:cs="Times New Roman"/>
         </w:rPr>
       </w:pPr>
+      <w:proofErr w:type="spellStart"/>
       <w:r>
         <w:rPr>
           <w:rFonts w:ascii="Times New Roman" w:hAnsi="Times New Roman" w:cs="Times New Roman"/>
@@ -2888,6 +3381,7 @@
         </w:rPr>
         <w:t>i</w:t>
       </w:r>
+      <w:proofErr w:type="spellEnd"/>
       <w:r>
         <w:rPr>
           <w:rFonts w:ascii="Times New Roman" w:hAnsi="Times New Roman" w:cs="Times New Roman"/>
@@ -2918,14 +3412,9 @@
         <w:rPr>
           <w:rFonts w:ascii="Times New Roman" w:hAnsi="Times New Roman" w:cs="Times New Roman"/>
         </w:rPr>
-        <w:t>;</w:t>
-      </w:r>
-      <w:r>
-        <w:rPr>
-          <w:rFonts w:ascii="Times New Roman" w:hAnsi="Times New Roman" w:cs="Times New Roman"/>
-        </w:rPr>
-        <w:t xml:space="preserve"> - численные переменные </w:t>
-      </w:r>
+        <w:t xml:space="preserve">; - численные переменные </w:t>
+      </w:r>
+      <w:proofErr w:type="spellStart"/>
       <w:r>
         <w:rPr>
           <w:rFonts w:ascii="Times New Roman" w:hAnsi="Times New Roman" w:cs="Times New Roman"/>
@@ -2933,12 +3422,14 @@
         </w:rPr>
         <w:t>i</w:t>
       </w:r>
+      <w:proofErr w:type="spellEnd"/>
       <w:r>
         <w:rPr>
           <w:rFonts w:ascii="Times New Roman" w:hAnsi="Times New Roman" w:cs="Times New Roman"/>
         </w:rPr>
         <w:t xml:space="preserve"> – индекс элемента строки </w:t>
       </w:r>
+      <w:proofErr w:type="spellStart"/>
       <w:r>
         <w:rPr>
           <w:rFonts w:ascii="Times New Roman" w:hAnsi="Times New Roman" w:cs="Times New Roman"/>
@@ -2946,6 +3437,7 @@
         </w:rPr>
         <w:t>LenSTR</w:t>
       </w:r>
+      <w:proofErr w:type="spellEnd"/>
       <w:r>
         <w:rPr>
           <w:rFonts w:ascii="Times New Roman" w:hAnsi="Times New Roman" w:cs="Times New Roman"/>
@@ -2978,8 +3470,23 @@
         <w:rPr>
           <w:rFonts w:ascii="Times New Roman" w:hAnsi="Times New Roman" w:cs="Times New Roman"/>
         </w:rPr>
-        <w:t xml:space="preserve">2) После того как посчитана длина </w:t>
-      </w:r>
+        <w:t xml:space="preserve">2) После </w:t>
+      </w:r>
+      <w:proofErr w:type="gramStart"/>
+      <w:r>
+        <w:rPr>
+          <w:rFonts w:ascii="Times New Roman" w:hAnsi="Times New Roman" w:cs="Times New Roman"/>
+        </w:rPr>
+        <w:t>того</w:t>
+      </w:r>
+      <w:proofErr w:type="gramEnd"/>
+      <w:r>
+        <w:rPr>
+          <w:rFonts w:ascii="Times New Roman" w:hAnsi="Times New Roman" w:cs="Times New Roman"/>
+        </w:rPr>
+        <w:t xml:space="preserve"> как посчитана длина </w:t>
+      </w:r>
+      <w:proofErr w:type="spellStart"/>
       <w:r>
         <w:rPr>
           <w:rFonts w:ascii="Times New Roman" w:hAnsi="Times New Roman" w:cs="Times New Roman"/>
@@ -2987,6 +3494,7 @@
         </w:rPr>
         <w:t>LenSTR</w:t>
       </w:r>
+      <w:proofErr w:type="spellEnd"/>
       <w:r>
         <w:rPr>
           <w:rFonts w:ascii="Times New Roman" w:hAnsi="Times New Roman" w:cs="Times New Roman"/>
@@ -3045,6 +3553,7 @@
         </w:rPr>
         <w:t xml:space="preserve"> индексов не станет больше числа строки </w:t>
       </w:r>
+      <w:proofErr w:type="spellStart"/>
       <w:r>
         <w:rPr>
           <w:rFonts w:ascii="Times New Roman" w:hAnsi="Times New Roman" w:cs="Times New Roman"/>
@@ -3052,6 +3561,7 @@
         </w:rPr>
         <w:t>LenSTR</w:t>
       </w:r>
+      <w:proofErr w:type="spellEnd"/>
       <w:r>
         <w:rPr>
           <w:rFonts w:ascii="Times New Roman" w:hAnsi="Times New Roman" w:cs="Times New Roman"/>
@@ -3084,6 +3594,40 @@
         </w:rPr>
         <w:t xml:space="preserve"> – счетчика символов.</w:t>
       </w:r>
+      <w:r>
+        <w:rPr>
+          <w:rFonts w:ascii="Times New Roman" w:hAnsi="Times New Roman" w:cs="Times New Roman"/>
+        </w:rPr>
+        <w:br/>
+      </w:r>
+      <w:r>
+        <w:rPr>
+          <w:rFonts w:ascii="Times New Roman" w:hAnsi="Times New Roman" w:cs="Times New Roman"/>
+          <w:lang w:val="en-US"/>
+        </w:rPr>
+        <w:t>new</w:t>
+      </w:r>
+      <w:r>
+        <w:rPr>
+          <w:rFonts w:ascii="Times New Roman" w:hAnsi="Times New Roman" w:cs="Times New Roman"/>
+        </w:rPr>
+        <w:t xml:space="preserve"> </w:t>
+      </w:r>
+      <w:r>
+        <w:rPr>
+          <w:rFonts w:ascii="Times New Roman" w:hAnsi="Times New Roman" w:cs="Times New Roman"/>
+          <w:lang w:val="en-US"/>
+        </w:rPr>
+        <w:t>test</w:t>
+      </w:r>
+    </w:p>
+    <w:p>
+      <w:pPr>
+        <w:spacing w:after="160" w:line="259" w:lineRule="auto"/>
+        <w:rPr>
+          <w:rFonts w:ascii="Times New Roman" w:hAnsi="Times New Roman" w:cs="Times New Roman"/>
+        </w:rPr>
+      </w:pPr>
     </w:p>
     <w:sectPr>
       <w:footerReference w:type="default" r:id="rId11"/>

</xml_diff>